<commit_message>
fix(acpos): canonicalize entity hierarchy and remove residual false denominators
</commit_message>
<xml_diff>
--- a/ACPOS_KB-01_知識庫_Mother_Basic_Design_OPTIMIZED.docx
+++ b/ACPOS_KB-01_知識庫_Mother_Basic_Design_OPTIMIZED.docx
@@ -4111,7 +4111,9 @@
               <w:spacing w:after="0"/>
               <w:jc w:val="center"/>
             </w:pPr>
-            <w:r/>
+            <w:r>
+              <w:t>Source Context</w:t>
+            </w:r>
             <w:r>
               <w:rPr>
                 <w:rFonts w:ascii="Noto Sans CJK TC" w:hAnsi="Noto Sans CJK TC" w:eastAsia="Noto Sans CJK TC"/>
@@ -4119,7 +4121,6 @@
                 <w:color w:val="FFFFFF"/>
                 <w:sz w:val="14"/>
               </w:rPr>
-              <w:t>父層 / Source</w:t>
             </w:r>
           </w:p>
         </w:tc>
@@ -4146,7 +4147,9 @@
               <w:spacing w:after="0"/>
               <w:jc w:val="center"/>
             </w:pPr>
-            <w:r/>
+            <w:r>
+              <w:t>Derived Object / Relation</w:t>
+            </w:r>
             <w:r>
               <w:rPr>
                 <w:rFonts w:ascii="Noto Sans CJK TC" w:hAnsi="Noto Sans CJK TC" w:eastAsia="Noto Sans CJK TC"/>
@@ -4154,7 +4157,6 @@
                 <w:color w:val="FFFFFF"/>
                 <w:sz w:val="14"/>
               </w:rPr>
-              <w:t>子層 / Derived Object</w:t>
             </w:r>
           </w:p>
         </w:tc>
@@ -4181,7 +4183,9 @@
               <w:spacing w:after="0"/>
               <w:jc w:val="center"/>
             </w:pPr>
-            <w:r/>
+            <w:r>
+              <w:t>強制關係</w:t>
+            </w:r>
             <w:r>
               <w:rPr>
                 <w:rFonts w:ascii="Noto Sans CJK TC" w:hAnsi="Noto Sans CJK TC" w:eastAsia="Noto Sans CJK TC"/>
@@ -4189,7 +4193,6 @@
                 <w:color w:val="FFFFFF"/>
                 <w:sz w:val="14"/>
               </w:rPr>
-              <w:t>強制關係</w:t>
             </w:r>
           </w:p>
         </w:tc>
@@ -4918,6 +4921,597 @@
                 <w:sz w:val="14"/>
               </w:rPr>
               <w:t>Human Review + mandatory checks + citation/outcome + conflict resolution + expected_version</w:t>
+            </w:r>
+          </w:p>
+        </w:tc>
+      </w:tr>
+    </w:tbl>
+    <w:tbl>
+      <w:tblPr>
+        <w:tblStyle w:val="TableGrid"/>
+        <w:tblW w:type="auto" w:w="0"/>
+        <w:tblLook w:firstColumn="1" w:firstRow="1" w:lastColumn="0" w:lastRow="0" w:noHBand="0" w:noVBand="1" w:val="04A0"/>
+      </w:tblPr>
+      <w:tblGrid>
+        <w:gridCol w:w="817"/>
+        <w:gridCol w:w="817"/>
+        <w:gridCol w:w="817"/>
+        <w:gridCol w:w="817"/>
+        <w:gridCol w:w="817"/>
+        <w:gridCol w:w="817"/>
+        <w:gridCol w:w="817"/>
+        <w:gridCol w:w="817"/>
+        <w:gridCol w:w="817"/>
+        <w:gridCol w:w="817"/>
+        <w:gridCol w:w="817"/>
+        <w:gridCol w:w="817"/>
+        <w:gridCol w:w="817"/>
+        <w:gridCol w:w="817"/>
+      </w:tblGrid>
+      <w:tr>
+        <w:tc>
+          <w:tcPr>
+            <w:tcW w:type="dxa" w:w="817"/>
+          </w:tcPr>
+          <w:p>
+            <w:r>
+              <w:t>Parent Identity</w:t>
+            </w:r>
+          </w:p>
+        </w:tc>
+        <w:tc>
+          <w:tcPr>
+            <w:tcW w:type="dxa" w:w="817"/>
+          </w:tcPr>
+          <w:p>
+            <w:r>
+              <w:t>Child Identity</w:t>
+            </w:r>
+          </w:p>
+        </w:tc>
+        <w:tc>
+          <w:tcPr>
+            <w:tcW w:type="dxa" w:w="817"/>
+          </w:tcPr>
+          <w:p>
+            <w:r>
+              <w:t>Cardinality</w:t>
+            </w:r>
+          </w:p>
+        </w:tc>
+        <w:tc>
+          <w:tcPr>
+            <w:tcW w:type="dxa" w:w="817"/>
+          </w:tcPr>
+          <w:p>
+            <w:r>
+              <w:t>Creation Entry</w:t>
+            </w:r>
+          </w:p>
+        </w:tc>
+        <w:tc>
+          <w:tcPr>
+            <w:tcW w:type="dxa" w:w="817"/>
+          </w:tcPr>
+          <w:p>
+            <w:r>
+              <w:t>Payload / Reference Binding</w:t>
+            </w:r>
+          </w:p>
+        </w:tc>
+        <w:tc>
+          <w:tcPr>
+            <w:tcW w:type="dxa" w:w="817"/>
+          </w:tcPr>
+          <w:p>
+            <w:r>
+              <w:t>Ordering Semantics</w:t>
+            </w:r>
+          </w:p>
+        </w:tc>
+        <w:tc>
+          <w:tcPr>
+            <w:tcW w:type="dxa" w:w="817"/>
+          </w:tcPr>
+          <w:p>
+            <w:r>
+              <w:t>Permission</w:t>
+            </w:r>
+          </w:p>
+        </w:tc>
+        <w:tc>
+          <w:tcPr>
+            <w:tcW w:type="dxa" w:w="817"/>
+          </w:tcPr>
+          <w:p>
+            <w:r>
+              <w:t>State Dependency</w:t>
+            </w:r>
+          </w:p>
+        </w:tc>
+        <w:tc>
+          <w:tcPr>
+            <w:tcW w:type="dxa" w:w="817"/>
+          </w:tcPr>
+          <w:p>
+            <w:r>
+              <w:t>Version Dependency</w:t>
+            </w:r>
+          </w:p>
+        </w:tc>
+        <w:tc>
+          <w:tcPr>
+            <w:tcW w:type="dxa" w:w="817"/>
+          </w:tcPr>
+          <w:p>
+            <w:r>
+              <w:t>Move / Reparent</w:t>
+            </w:r>
+          </w:p>
+        </w:tc>
+        <w:tc>
+          <w:tcPr>
+            <w:tcW w:type="dxa" w:w="817"/>
+          </w:tcPr>
+          <w:p>
+            <w:r>
+              <w:t>Archive / Delete Propagation</w:t>
+            </w:r>
+          </w:p>
+        </w:tc>
+        <w:tc>
+          <w:tcPr>
+            <w:tcW w:type="dxa" w:w="817"/>
+          </w:tcPr>
+          <w:p>
+            <w:r>
+              <w:t>Upstream Change Impact</w:t>
+            </w:r>
+          </w:p>
+        </w:tc>
+        <w:tc>
+          <w:tcPr>
+            <w:tcW w:type="dxa" w:w="817"/>
+          </w:tcPr>
+          <w:p>
+            <w:r>
+              <w:t>Downstream Revalidation</w:t>
+            </w:r>
+          </w:p>
+        </w:tc>
+        <w:tc>
+          <w:tcPr>
+            <w:tcW w:type="dxa" w:w="817"/>
+          </w:tcPr>
+          <w:p>
+            <w:r>
+              <w:t>Authority Evidence</w:t>
+            </w:r>
+          </w:p>
+        </w:tc>
+      </w:tr>
+      <w:tr>
+        <w:tc>
+          <w:tcPr>
+            <w:tcW w:type="dxa" w:w="817"/>
+          </w:tcPr>
+          <w:p>
+            <w:r>
+              <w:t>KnowledgeSource</w:t>
+            </w:r>
+          </w:p>
+        </w:tc>
+        <w:tc>
+          <w:tcPr>
+            <w:tcW w:type="dxa" w:w="817"/>
+          </w:tcPr>
+          <w:p>
+            <w:r>
+              <w:t>Acquisition Run</w:t>
+            </w:r>
+          </w:p>
+        </w:tc>
+        <w:tc>
+          <w:tcPr>
+            <w:tcW w:type="dxa" w:w="817"/>
+          </w:tcPr>
+          <w:p>
+            <w:r>
+              <w:t>1:N</w:t>
+            </w:r>
+          </w:p>
+        </w:tc>
+        <w:tc>
+          <w:tcPr>
+            <w:tcW w:type="dxa" w:w="817"/>
+          </w:tcPr>
+          <w:p>
+            <w:r>
+              <w:t>Submit KnowledgeAcquisitionIntent value object to Shared Acquisition Runtime; create/retry governed Acquisition Run.</w:t>
+            </w:r>
+          </w:p>
+        </w:tc>
+        <w:tc>
+          <w:tcPr>
+            <w:tcW w:type="dxa" w:w="817"/>
+          </w:tcPr>
+          <w:p>
+            <w:r>
+              <w:t>source_ref + scope + acquisition_mode + correlation_id + idempotency_key; Runtime owns fetch/retry/snapshot/dedupe.</w:t>
+            </w:r>
+          </w:p>
+        </w:tc>
+        <w:tc>
+          <w:tcPr>
+            <w:tcW w:type="dxa" w:w="817"/>
+          </w:tcPr>
+          <w:p>
+            <w:r>
+              <w:t>Run creation/attempt sequence; manual REORDER is NOT_APPLICABLE.</w:t>
+            </w:r>
+          </w:p>
+        </w:tc>
+        <w:tc>
+          <w:tcPr>
+            <w:tcW w:type="dxa" w:w="817"/>
+          </w:tcPr>
+          <w:p>
+            <w:r>
+              <w:t>knowledge.source.read + knowledge.ingestion.execute + authorized scope/rights/classification; fail closed.</w:t>
+            </w:r>
+          </w:p>
+        </w:tc>
+        <w:tc>
+          <w:tcPr>
+            <w:tcW w:type="dxa" w:w="817"/>
+          </w:tcPr>
+          <w:p>
+            <w:r>
+              <w:t>KnowledgeSource must be current and allowed by rights/classification/state; retired source cannot silently restart.</w:t>
+            </w:r>
+          </w:p>
+        </w:tc>
+        <w:tc>
+          <w:tcPr>
+            <w:tcW w:type="dxa" w:w="817"/>
+          </w:tcPr>
+          <w:p>
+            <w:r>
+              <w:t>Exact source_ref/source version + run identity/checkpoint; historical run evidence remains immutable.</w:t>
+            </w:r>
+          </w:p>
+        </w:tc>
+        <w:tc>
+          <w:tcPr>
+            <w:tcW w:type="dxa" w:w="817"/>
+          </w:tcPr>
+          <w:p>
+            <w:r>
+              <w:t>NOT_APPLICABLE — Run stays bound to its source_ref.</w:t>
+            </w:r>
+          </w:p>
+        </w:tc>
+        <w:tc>
+          <w:tcPr>
+            <w:tcW w:type="dxa" w:w="817"/>
+          </w:tcPr>
+          <w:p>
+            <w:r>
+              <w:t>NO_CASCADE — retiring Source does not delete immutable Run/Snapshot/Evidence history.</w:t>
+            </w:r>
+          </w:p>
+        </w:tc>
+        <w:tc>
+          <w:tcPr>
+            <w:tcW w:type="dxa" w:w="817"/>
+          </w:tcPr>
+          <w:p>
+            <w:r>
+              <w:t>Source scope/rights/classification/version change invalidates future-run assumptions and affected unresolved consumers.</w:t>
+            </w:r>
+          </w:p>
+        </w:tc>
+        <w:tc>
+          <w:tcPr>
+            <w:tcW w:type="dxa" w:w="817"/>
+          </w:tcPr>
+          <w:p>
+            <w:r>
+              <w:t>Fresh run/consumer verification required where source authority materially changes; historical evidence is preserved.</w:t>
+            </w:r>
+          </w:p>
+        </w:tc>
+        <w:tc>
+          <w:tcPr>
+            <w:tcW w:type="dxa" w:w="817"/>
+          </w:tcPr>
+          <w:p>
+            <w:r>
+              <w:t>KB-01 Tables 5,7,11,13,15,17-20; CreateKnowledgeAcquisitionIntentRequest; Mother §71.</w:t>
+            </w:r>
+          </w:p>
+        </w:tc>
+      </w:tr>
+      <w:tr>
+        <w:tc>
+          <w:tcPr>
+            <w:tcW w:type="dxa" w:w="817"/>
+          </w:tcPr>
+          <w:p>
+            <w:r>
+              <w:t>Experience / Replay</w:t>
+            </w:r>
+          </w:p>
+        </w:tc>
+        <w:tc>
+          <w:tcPr>
+            <w:tcW w:type="dxa" w:w="817"/>
+          </w:tcPr>
+          <w:p>
+            <w:r>
+              <w:t>Learning Candidate</w:t>
+            </w:r>
+          </w:p>
+        </w:tc>
+        <w:tc>
+          <w:tcPr>
+            <w:tcW w:type="dxa" w:w="817"/>
+          </w:tcPr>
+          <w:p>
+            <w:r>
+              <w:t>N:M via experience_refs</w:t>
+            </w:r>
+          </w:p>
+        </w:tc>
+        <w:tc>
+          <w:tcPr>
+            <w:tcW w:type="dxa" w:w="817"/>
+          </w:tcPr>
+          <w:p>
+            <w:r>
+              <w:t>Create Learning Candidate only from real execution with OUTCOME_COMPLETE and resolvable lineage.</w:t>
+            </w:r>
+          </w:p>
+        </w:tc>
+        <w:tc>
+          <w:tcPr>
+            <w:tcW w:type="dxa" w:w="817"/>
+          </w:tcPr>
+          <w:p>
+            <w:r>
+              <w:t>experience_refs + scope + pattern + proposed_improvement + evidence_refs + limitations + correlation/idempotency</w:t>
+            </w:r>
+          </w:p>
+        </w:tc>
+        <w:tc>
+          <w:tcPr>
+            <w:tcW w:type="dxa" w:w="817"/>
+          </w:tcPr>
+          <w:p>
+            <w:r>
+              <w:t>No user-managed sibling order; REORDER is NOT_APPLICABLE.</w:t>
+            </w:r>
+          </w:p>
+        </w:tc>
+        <w:tc>
+          <w:tcPr>
+            <w:tcW w:type="dxa" w:w="817"/>
+          </w:tcPr>
+          <w:p>
+            <w:r>
+              <w:t>knowledge.experience.read + knowledge.learning.create; exact scope/evidence gate; fail closed.</w:t>
+            </w:r>
+          </w:p>
+        </w:tc>
+        <w:tc>
+          <w:tcPr>
+            <w:tcW w:type="dxa" w:w="817"/>
+          </w:tcPr>
+          <w:p>
+            <w:r>
+              <w:t>Experience outcome must be complete; missing real outcome forbids learning creation.</w:t>
+            </w:r>
+          </w:p>
+        </w:tc>
+        <w:tc>
+          <w:tcPr>
+            <w:tcW w:type="dxa" w:w="817"/>
+          </w:tcPr>
+          <w:p>
+            <w:r>
+              <w:t>Exact experience/evidence refs and lineage; supersession preserves prior evidence.</w:t>
+            </w:r>
+          </w:p>
+        </w:tc>
+        <w:tc>
+          <w:tcPr>
+            <w:tcW w:type="dxa" w:w="817"/>
+          </w:tcPr>
+          <w:p>
+            <w:r>
+              <w:t>NOT_APPLICABLE — candidate references exact Experience records; no reparent operation is authorized.</w:t>
+            </w:r>
+          </w:p>
+        </w:tc>
+        <w:tc>
+          <w:tcPr>
+            <w:tcW w:type="dxa" w:w="817"/>
+          </w:tcPr>
+          <w:p>
+            <w:r>
+              <w:t>NO_CASCADE — Experience remains immutable; Learning Candidate may be superseded/rejected by its owner.</w:t>
+            </w:r>
+          </w:p>
+        </w:tc>
+        <w:tc>
+          <w:tcPr>
+            <w:tcW w:type="dxa" w:w="817"/>
+          </w:tcPr>
+          <w:p>
+            <w:r>
+              <w:t>Material evidence/outcome correction requires candidate impact review and invalidates unsupported assumptions.</w:t>
+            </w:r>
+          </w:p>
+        </w:tc>
+        <w:tc>
+          <w:tcPr>
+            <w:tcW w:type="dxa" w:w="817"/>
+          </w:tcPr>
+          <w:p>
+            <w:r>
+              <w:t>Affected Learning Candidate review/adoption evidence becomes REVERIFY_REQUIRED before downstream governance use.</w:t>
+            </w:r>
+          </w:p>
+        </w:tc>
+        <w:tc>
+          <w:tcPr>
+            <w:tcW w:type="dxa" w:w="817"/>
+          </w:tcPr>
+          <w:p>
+            <w:r>
+              <w:t>KB-01 Tables 5,7,11,13,15,17-20; CreateACPOSLearningCandidateRequest; Mother §71.</w:t>
+            </w:r>
+          </w:p>
+        </w:tc>
+      </w:tr>
+      <w:tr>
+        <w:tc>
+          <w:tcPr>
+            <w:tcW w:type="dxa" w:w="817"/>
+          </w:tcPr>
+          <w:p>
+            <w:r>
+              <w:t>Experience / Replay</w:t>
+            </w:r>
+          </w:p>
+        </w:tc>
+        <w:tc>
+          <w:tcPr>
+            <w:tcW w:type="dxa" w:w="817"/>
+          </w:tcPr>
+          <w:p>
+            <w:r>
+              <w:t>KnowledgeVersion</w:t>
+            </w:r>
+          </w:p>
+        </w:tc>
+        <w:tc>
+          <w:tcPr>
+            <w:tcW w:type="dxa" w:w="817"/>
+          </w:tcPr>
+          <w:p>
+            <w:r>
+              <w:t>N:M evidence lineage</w:t>
+            </w:r>
+          </w:p>
+        </w:tc>
+        <w:tc>
+          <w:tcPr>
+            <w:tcW w:type="dxa" w:w="817"/>
+          </w:tcPr>
+          <w:p>
+            <w:r>
+              <w:t>Create Knowledge Draft/Version from Experience, then save draft and enter mandatory Human Review.</w:t>
+            </w:r>
+          </w:p>
+        </w:tc>
+        <w:tc>
+          <w:tcPr>
+            <w:tcW w:type="dxa" w:w="817"/>
+          </w:tcPr>
+          <w:p>
+            <w:r>
+              <w:t>exact experience/evidence refs + knowledge_id + expected_version + title/type/scope/classification + citations/outcomes</w:t>
+            </w:r>
+          </w:p>
+        </w:tc>
+        <w:tc>
+          <w:tcPr>
+            <w:tcW w:type="dxa" w:w="817"/>
+          </w:tcPr>
+          <w:p>
+            <w:r>
+              <w:t>Version sequence is governed; manual REORDER is NOT_APPLICABLE.</w:t>
+            </w:r>
+          </w:p>
+        </w:tc>
+        <w:tc>
+          <w:tcPr>
+            <w:tcW w:type="dxa" w:w="817"/>
+          </w:tcPr>
+          <w:p>
+            <w:r>
+              <w:t>knowledge.experience.read + knowledge draft/review permissions + mandatory review gates; fail closed.</w:t>
+            </w:r>
+          </w:p>
+        </w:tc>
+        <w:tc>
+          <w:tcPr>
+            <w:tcW w:type="dxa" w:w="817"/>
+          </w:tcPr>
+          <w:p>
+            <w:r>
+              <w:t>Real Experience/outcome evidence must resolve; KnowledgeVersion follows DRAFT→REVIEW→APPROVED/RETURNED/REJECTED→SUPERSEDED/RETIRED.</w:t>
+            </w:r>
+          </w:p>
+        </w:tc>
+        <w:tc>
+          <w:tcPr>
+            <w:tcW w:type="dxa" w:w="817"/>
+          </w:tcPr>
+          <w:p>
+            <w:r>
+              <w:t>expected_version + exact prior approved version + evidence/citation refs; Approved version is immutable.</w:t>
+            </w:r>
+          </w:p>
+        </w:tc>
+        <w:tc>
+          <w:tcPr>
+            <w:tcW w:type="dxa" w:w="817"/>
+          </w:tcPr>
+          <w:p>
+            <w:r>
+              <w:t>NOT_APPLICABLE — new version supersedes exact prior; reparent is not an authorized operation.</w:t>
+            </w:r>
+          </w:p>
+        </w:tc>
+        <w:tc>
+          <w:tcPr>
+            <w:tcW w:type="dxa" w:w="817"/>
+          </w:tcPr>
+          <w:p>
+            <w:r>
+              <w:t>NO_CASCADE — supersession/retirement preserves prior approved version and evidence lineage.</w:t>
+            </w:r>
+          </w:p>
+        </w:tc>
+        <w:tc>
+          <w:tcPr>
+            <w:tcW w:type="dxa" w:w="817"/>
+          </w:tcPr>
+          <w:p>
+            <w:r>
+              <w:t>Changed experience/citation/outcome before approval requires diff/impact review; approved immutable versions are not overwritten.</w:t>
+            </w:r>
+          </w:p>
+        </w:tc>
+        <w:tc>
+          <w:tcPr>
+            <w:tcW w:type="dxa" w:w="817"/>
+          </w:tcPr>
+          <w:p>
+            <w:r>
+              <w:t>Mandatory checks + Human Review rerun for impacted Draft/Review candidate before approval.</w:t>
+            </w:r>
+          </w:p>
+        </w:tc>
+        <w:tc>
+          <w:tcPr>
+            <w:tcW w:type="dxa" w:w="817"/>
+          </w:tcPr>
+          <w:p>
+            <w:r>
+              <w:t>KB-01 Tables 5,7,11,13,15,17-20; SaveKnowledgeDraftRequest + Knowledge APPROVE gate; Mother §71.</w:t>
             </w:r>
           </w:p>
         </w:tc>

</xml_diff>

<commit_message>
fix(acpos): complete remaining 20 Word persistence owner contracts
</commit_message>
<xml_diff>
--- a/ACPOS_KB-01_知識庫_Mother_Basic_Design_OPTIMIZED.docx
+++ b/ACPOS_KB-01_知識庫_Mother_Basic_Design_OPTIMIZED.docx
@@ -21629,7 +21629,7 @@
               <w:rPr>
                 <w:sz w:val="10"/>
               </w:rPr>
-              <w:t>—</w:t>
+              <w:t>KnowledgeExperienceService / KnowledgeSource State + Version + Audit</w:t>
             </w:r>
           </w:p>
         </w:tc>
@@ -21800,7 +21800,7 @@
               <w:rPr>
                 <w:sz w:val="10"/>
               </w:rPr>
-              <w:t>—</w:t>
+              <w:t>KnowledgeExperienceService / KnowledgeSource State + Version + Audit</w:t>
             </w:r>
           </w:p>
         </w:tc>
@@ -21971,7 +21971,7 @@
               <w:rPr>
                 <w:sz w:val="10"/>
               </w:rPr>
-              <w:t>—</w:t>
+              <w:t>KnowledgeExperienceService / KnowledgeSource State + Version + Audit</w:t>
             </w:r>
           </w:p>
         </w:tc>
@@ -22142,7 +22142,7 @@
               <w:rPr>
                 <w:sz w:val="10"/>
               </w:rPr>
-              <w:t>—</w:t>
+              <w:t>KnowledgeExperienceService / KnowledgeSource State + Version + Audit</w:t>
             </w:r>
           </w:p>
         </w:tc>
@@ -22313,7 +22313,7 @@
               <w:rPr>
                 <w:sz w:val="10"/>
               </w:rPr>
-              <w:t>—</w:t>
+              <w:t>KnowledgeExperienceService / KnowledgeSource State + Version + Audit</w:t>
             </w:r>
           </w:p>
         </w:tc>
@@ -22484,7 +22484,7 @@
               <w:rPr>
                 <w:sz w:val="10"/>
               </w:rPr>
-              <w:t>—</w:t>
+              <w:t>Shared Acquisition Runtime / Acquisition Run + Snapshot/Evidence + Audit</w:t>
             </w:r>
           </w:p>
         </w:tc>
@@ -22655,7 +22655,7 @@
               <w:rPr>
                 <w:sz w:val="10"/>
               </w:rPr>
-              <w:t>—</w:t>
+              <w:t>Shared Acquisition Runtime / Acquisition Run + Snapshot/Evidence + Audit</w:t>
             </w:r>
           </w:p>
         </w:tc>
@@ -23510,7 +23510,7 @@
               <w:rPr>
                 <w:sz w:val="10"/>
               </w:rPr>
-              <w:t>—</w:t>
+              <w:t>ACPOSContextEngine / ACPOSContextCandidate + Evidence/Audit</w:t>
             </w:r>
           </w:p>
         </w:tc>
@@ -24023,7 +24023,7 @@
               <w:rPr>
                 <w:sz w:val="10"/>
               </w:rPr>
-              <w:t>—</w:t>
+              <w:t>ACPOSEvolutionEngine / ACPOSLearningCandidate + Evidence/Audit</w:t>
             </w:r>
           </w:p>
         </w:tc>
@@ -24194,7 +24194,7 @@
               <w:rPr>
                 <w:sz w:val="10"/>
               </w:rPr>
-              <w:t>—</w:t>
+              <w:t>KnowledgeExperienceService / KnowledgeVersion Draft + Evidence/Citation + Audit</w:t>
             </w:r>
           </w:p>
         </w:tc>
@@ -24365,7 +24365,7 @@
               <w:rPr>
                 <w:sz w:val="10"/>
               </w:rPr>
-              <w:t>—</w:t>
+              <w:t>KnowledgeExperienceService / KnowledgeVersion Draft + Evidence/Citation + Audit</w:t>
             </w:r>
           </w:p>
         </w:tc>
@@ -24707,7 +24707,7 @@
               <w:rPr>
                 <w:sz w:val="10"/>
               </w:rPr>
-              <w:t>—</w:t>
+              <w:t>KnowledgeExperienceService / KnowledgeVersion Review State + Approval/Review + Audit</w:t>
             </w:r>
           </w:p>
         </w:tc>
@@ -24878,7 +24878,7 @@
               <w:rPr>
                 <w:sz w:val="10"/>
               </w:rPr>
-              <w:t>—</w:t>
+              <w:t>KnowledgeExperienceService / KnowledgeVersion Review State + Approval/Review + Audit</w:t>
             </w:r>
           </w:p>
         </w:tc>
@@ -25049,7 +25049,7 @@
               <w:rPr>
                 <w:sz w:val="10"/>
               </w:rPr>
-              <w:t>—</w:t>
+              <w:t>KnowledgeExperienceService / KnowledgeVersion Review State + Approval/Review + Audit</w:t>
             </w:r>
           </w:p>
         </w:tc>
@@ -34590,6 +34590,881 @@
           <w:p>
             <w:r>
               <w:t>DESIGN_FREEZE_PACKAGE_DEFINED. DESIGN_FROZEN may be asserted only after required Visual Preview/Review/Approval and all applicable design gates actually pass; this annex does not self-approve.</w:t>
+            </w:r>
+          </w:p>
+        </w:tc>
+      </w:tr>
+    </w:tbl>
+    <w:p>
+      <w:r>
+        <w:br w:type="page"/>
+      </w:r>
+    </w:p>
+    <w:p>
+      <w:pPr>
+        <w:pStyle w:val="Heading1"/>
+      </w:pPr>
+      <w:r>
+        <w:t>KB-01 Persistence Owner Closure｜知識與經驗持久化 Owner 收斂</w:t>
+      </w:r>
+    </w:p>
+    <w:p>
+      <w:r>
+        <w:t>[ACPOS-KB-PERSISTENCE-OWNER-CLOSURE-V1] This annex closes the 14 KB-01 mutation Persistence Owner gaps from the existing Entity/Canonical Owner table, lifecycle matrix, relationship contract and Action Group/Owner table. It introduces no second Knowledge, Context, Learning or Acquisition owner.</w:t>
+      </w:r>
+    </w:p>
+    <w:tbl>
+      <w:tblPr>
+        <w:tblStyle w:val="TableGrid"/>
+        <w:tblW w:type="auto" w:w="0"/>
+        <w:tblLook w:firstColumn="1" w:firstRow="1" w:lastColumn="0" w:lastRow="0" w:noHBand="0" w:noVBand="1" w:val="04A0"/>
+      </w:tblPr>
+      <w:tblGrid>
+        <w:gridCol w:w="2858"/>
+        <w:gridCol w:w="2858"/>
+        <w:gridCol w:w="2858"/>
+        <w:gridCol w:w="2858"/>
+      </w:tblGrid>
+      <w:tr>
+        <w:trPr>
+          <w:cantSplit/>
+        </w:trPr>
+        <w:tc>
+          <w:tcPr>
+            <w:tcW w:type="dxa" w:w="2858"/>
+          </w:tcPr>
+          <w:p>
+            <w:r>
+              <w:t>Control UID</w:t>
+            </w:r>
+          </w:p>
+        </w:tc>
+        <w:tc>
+          <w:tcPr>
+            <w:tcW w:type="dxa" w:w="2858"/>
+          </w:tcPr>
+          <w:p>
+            <w:r>
+              <w:t>Business Entity / Resolution</w:t>
+            </w:r>
+          </w:p>
+        </w:tc>
+        <w:tc>
+          <w:tcPr>
+            <w:tcW w:type="dxa" w:w="2858"/>
+          </w:tcPr>
+          <w:p>
+            <w:r>
+              <w:t>Canonical Persistence Owner</w:t>
+            </w:r>
+          </w:p>
+        </w:tc>
+        <w:tc>
+          <w:tcPr>
+            <w:tcW w:type="dxa" w:w="2858"/>
+          </w:tcPr>
+          <w:p>
+            <w:r>
+              <w:t>Design Semantics</w:t>
+            </w:r>
+          </w:p>
+        </w:tc>
+      </w:tr>
+      <w:tr>
+        <w:trPr>
+          <w:cantSplit/>
+        </w:trPr>
+        <w:tc>
+          <w:tcPr>
+            <w:tcW w:type="dxa" w:w="2858"/>
+          </w:tcPr>
+          <w:p>
+            <w:r>
+              <w:t>KB-01-CTL-SOURCE-CREATE</w:t>
+            </w:r>
+          </w:p>
+        </w:tc>
+        <w:tc>
+          <w:tcPr>
+            <w:tcW w:type="dxa" w:w="2858"/>
+          </w:tcPr>
+          <w:p>
+            <w:r>
+              <w:t>KnowledgeSource</w:t>
+            </w:r>
+          </w:p>
+        </w:tc>
+        <w:tc>
+          <w:tcPr>
+            <w:tcW w:type="dxa" w:w="2858"/>
+          </w:tcPr>
+          <w:p>
+            <w:r>
+              <w:t>KnowledgeExperienceService / KnowledgeSource State + Version + Audit</w:t>
+            </w:r>
+          </w:p>
+        </w:tc>
+        <w:tc>
+          <w:tcPr>
+            <w:tcW w:type="dxa" w:w="2858"/>
+          </w:tcPr>
+          <w:p>
+            <w:r>
+              <w:t>Source create/update/state-transition persists the exact KnowledgeSource identity, scope/rights/classification/configuration, lifecycle state/version and audit lineage. RETIRED may not be silently revived; historical source/version evidence remains addressable.</w:t>
+            </w:r>
+          </w:p>
+        </w:tc>
+      </w:tr>
+      <w:tr>
+        <w:trPr>
+          <w:cantSplit/>
+        </w:trPr>
+        <w:tc>
+          <w:tcPr>
+            <w:tcW w:type="dxa" w:w="2858"/>
+          </w:tcPr>
+          <w:p>
+            <w:r>
+              <w:t>KB-01-CTL-SOURCE-SAVE</w:t>
+            </w:r>
+          </w:p>
+        </w:tc>
+        <w:tc>
+          <w:tcPr>
+            <w:tcW w:type="dxa" w:w="2858"/>
+          </w:tcPr>
+          <w:p>
+            <w:r>
+              <w:t>KnowledgeSource</w:t>
+            </w:r>
+          </w:p>
+        </w:tc>
+        <w:tc>
+          <w:tcPr>
+            <w:tcW w:type="dxa" w:w="2858"/>
+          </w:tcPr>
+          <w:p>
+            <w:r>
+              <w:t>KnowledgeExperienceService / KnowledgeSource State + Version + Audit</w:t>
+            </w:r>
+          </w:p>
+        </w:tc>
+        <w:tc>
+          <w:tcPr>
+            <w:tcW w:type="dxa" w:w="2858"/>
+          </w:tcPr>
+          <w:p>
+            <w:r>
+              <w:t>Source create/update/state-transition persists the exact KnowledgeSource identity, scope/rights/classification/configuration, lifecycle state/version and audit lineage. RETIRED may not be silently revived; historical source/version evidence remains addressable.</w:t>
+            </w:r>
+          </w:p>
+        </w:tc>
+      </w:tr>
+      <w:tr>
+        <w:trPr>
+          <w:cantSplit/>
+        </w:trPr>
+        <w:tc>
+          <w:tcPr>
+            <w:tcW w:type="dxa" w:w="2858"/>
+          </w:tcPr>
+          <w:p>
+            <w:r>
+              <w:t>KB-01-CTL-SOURCE-PAUSE</w:t>
+            </w:r>
+          </w:p>
+        </w:tc>
+        <w:tc>
+          <w:tcPr>
+            <w:tcW w:type="dxa" w:w="2858"/>
+          </w:tcPr>
+          <w:p>
+            <w:r>
+              <w:t>KnowledgeSource</w:t>
+            </w:r>
+          </w:p>
+        </w:tc>
+        <w:tc>
+          <w:tcPr>
+            <w:tcW w:type="dxa" w:w="2858"/>
+          </w:tcPr>
+          <w:p>
+            <w:r>
+              <w:t>KnowledgeExperienceService / KnowledgeSource State + Version + Audit</w:t>
+            </w:r>
+          </w:p>
+        </w:tc>
+        <w:tc>
+          <w:tcPr>
+            <w:tcW w:type="dxa" w:w="2858"/>
+          </w:tcPr>
+          <w:p>
+            <w:r>
+              <w:t>Source create/update/state-transition persists the exact KnowledgeSource identity, scope/rights/classification/configuration, lifecycle state/version and audit lineage. RETIRED may not be silently revived; historical source/version evidence remains addressable.</w:t>
+            </w:r>
+          </w:p>
+        </w:tc>
+      </w:tr>
+      <w:tr>
+        <w:trPr>
+          <w:cantSplit/>
+        </w:trPr>
+        <w:tc>
+          <w:tcPr>
+            <w:tcW w:type="dxa" w:w="2858"/>
+          </w:tcPr>
+          <w:p>
+            <w:r>
+              <w:t>KB-01-CTL-SOURCE-RESUME</w:t>
+            </w:r>
+          </w:p>
+        </w:tc>
+        <w:tc>
+          <w:tcPr>
+            <w:tcW w:type="dxa" w:w="2858"/>
+          </w:tcPr>
+          <w:p>
+            <w:r>
+              <w:t>KnowledgeSource</w:t>
+            </w:r>
+          </w:p>
+        </w:tc>
+        <w:tc>
+          <w:tcPr>
+            <w:tcW w:type="dxa" w:w="2858"/>
+          </w:tcPr>
+          <w:p>
+            <w:r>
+              <w:t>KnowledgeExperienceService / KnowledgeSource State + Version + Audit</w:t>
+            </w:r>
+          </w:p>
+        </w:tc>
+        <w:tc>
+          <w:tcPr>
+            <w:tcW w:type="dxa" w:w="2858"/>
+          </w:tcPr>
+          <w:p>
+            <w:r>
+              <w:t>Source create/update/state-transition persists the exact KnowledgeSource identity, scope/rights/classification/configuration, lifecycle state/version and audit lineage. RETIRED may not be silently revived; historical source/version evidence remains addressable.</w:t>
+            </w:r>
+          </w:p>
+        </w:tc>
+      </w:tr>
+      <w:tr>
+        <w:trPr>
+          <w:cantSplit/>
+        </w:trPr>
+        <w:tc>
+          <w:tcPr>
+            <w:tcW w:type="dxa" w:w="2858"/>
+          </w:tcPr>
+          <w:p>
+            <w:r>
+              <w:t>KB-01-CTL-SOURCE-RETIRE</w:t>
+            </w:r>
+          </w:p>
+        </w:tc>
+        <w:tc>
+          <w:tcPr>
+            <w:tcW w:type="dxa" w:w="2858"/>
+          </w:tcPr>
+          <w:p>
+            <w:r>
+              <w:t>KnowledgeSource</w:t>
+            </w:r>
+          </w:p>
+        </w:tc>
+        <w:tc>
+          <w:tcPr>
+            <w:tcW w:type="dxa" w:w="2858"/>
+          </w:tcPr>
+          <w:p>
+            <w:r>
+              <w:t>KnowledgeExperienceService / KnowledgeSource State + Version + Audit</w:t>
+            </w:r>
+          </w:p>
+        </w:tc>
+        <w:tc>
+          <w:tcPr>
+            <w:tcW w:type="dxa" w:w="2858"/>
+          </w:tcPr>
+          <w:p>
+            <w:r>
+              <w:t>Source create/update/state-transition persists the exact KnowledgeSource identity, scope/rights/classification/configuration, lifecycle state/version and audit lineage. RETIRED may not be silently revived; historical source/version evidence remains addressable.</w:t>
+            </w:r>
+          </w:p>
+        </w:tc>
+      </w:tr>
+      <w:tr>
+        <w:trPr>
+          <w:cantSplit/>
+        </w:trPr>
+        <w:tc>
+          <w:tcPr>
+            <w:tcW w:type="dxa" w:w="2858"/>
+          </w:tcPr>
+          <w:p>
+            <w:r>
+              <w:t>KB-01-CTL-INGEST-START</w:t>
+            </w:r>
+          </w:p>
+        </w:tc>
+        <w:tc>
+          <w:tcPr>
+            <w:tcW w:type="dxa" w:w="2858"/>
+          </w:tcPr>
+          <w:p>
+            <w:r>
+              <w:t>Acquisition Run</w:t>
+            </w:r>
+          </w:p>
+        </w:tc>
+        <w:tc>
+          <w:tcPr>
+            <w:tcW w:type="dxa" w:w="2858"/>
+          </w:tcPr>
+          <w:p>
+            <w:r>
+              <w:t>Shared Acquisition Runtime / Acquisition Run + Snapshot/Evidence + Audit</w:t>
+            </w:r>
+          </w:p>
+        </w:tc>
+        <w:tc>
+          <w:tcPr>
+            <w:tcW w:type="dxa" w:w="2858"/>
+          </w:tcPr>
+          <w:p>
+            <w:r>
+              <w:t>KnowledgeAcquisitionIntent is a value object; create/retry persists a governed Acquisition Run under Shared Acquisition Runtime with exact source_ref/scope/mode/correlation/idempotency, attempt/checkpoint, immutable snapshot/evidence and audit lineage. It does not create a second crawler owner.</w:t>
+            </w:r>
+          </w:p>
+        </w:tc>
+      </w:tr>
+      <w:tr>
+        <w:trPr>
+          <w:cantSplit/>
+        </w:trPr>
+        <w:tc>
+          <w:tcPr>
+            <w:tcW w:type="dxa" w:w="2858"/>
+          </w:tcPr>
+          <w:p>
+            <w:r>
+              <w:t>KB-01-CTL-INGEST-RETRY</w:t>
+            </w:r>
+          </w:p>
+        </w:tc>
+        <w:tc>
+          <w:tcPr>
+            <w:tcW w:type="dxa" w:w="2858"/>
+          </w:tcPr>
+          <w:p>
+            <w:r>
+              <w:t>Acquisition Run</w:t>
+            </w:r>
+          </w:p>
+        </w:tc>
+        <w:tc>
+          <w:tcPr>
+            <w:tcW w:type="dxa" w:w="2858"/>
+          </w:tcPr>
+          <w:p>
+            <w:r>
+              <w:t>Shared Acquisition Runtime / Acquisition Run + Snapshot/Evidence + Audit</w:t>
+            </w:r>
+          </w:p>
+        </w:tc>
+        <w:tc>
+          <w:tcPr>
+            <w:tcW w:type="dxa" w:w="2858"/>
+          </w:tcPr>
+          <w:p>
+            <w:r>
+              <w:t>KnowledgeAcquisitionIntent is a value object; create/retry persists a governed Acquisition Run under Shared Acquisition Runtime with exact source_ref/scope/mode/correlation/idempotency, attempt/checkpoint, immutable snapshot/evidence and audit lineage. It does not create a second crawler owner.</w:t>
+            </w:r>
+          </w:p>
+        </w:tc>
+      </w:tr>
+      <w:tr>
+        <w:trPr>
+          <w:cantSplit/>
+        </w:trPr>
+        <w:tc>
+          <w:tcPr>
+            <w:tcW w:type="dxa" w:w="2858"/>
+          </w:tcPr>
+          <w:p>
+            <w:r>
+              <w:t>KB-01-CTL-CONTEXT-CREATE</w:t>
+            </w:r>
+          </w:p>
+        </w:tc>
+        <w:tc>
+          <w:tcPr>
+            <w:tcW w:type="dxa" w:w="2858"/>
+          </w:tcPr>
+          <w:p>
+            <w:r>
+              <w:t>ACPOSContextCandidate</w:t>
+            </w:r>
+          </w:p>
+        </w:tc>
+        <w:tc>
+          <w:tcPr>
+            <w:tcW w:type="dxa" w:w="2858"/>
+          </w:tcPr>
+          <w:p>
+            <w:r>
+              <w:t>ACPOSContextEngine / ACPOSContextCandidate + Evidence/Audit</w:t>
+            </w:r>
+          </w:p>
+        </w:tc>
+        <w:tc>
+          <w:tcPr>
+            <w:tcW w:type="dxa" w:w="2858"/>
+          </w:tcPr>
+          <w:p>
+            <w:r>
+              <w:t>Creates a governed Context Candidate from authorized Knowledge/Fact/Evidence refs. Candidate remains READY_FOR_CONSUMER_REVIEW and does not self-adopt or duplicate source Authority payload.</w:t>
+            </w:r>
+          </w:p>
+        </w:tc>
+      </w:tr>
+      <w:tr>
+        <w:trPr>
+          <w:cantSplit/>
+        </w:trPr>
+        <w:tc>
+          <w:tcPr>
+            <w:tcW w:type="dxa" w:w="2858"/>
+          </w:tcPr>
+          <w:p>
+            <w:r>
+              <w:t>KB-01-CTL-LEARNING-CREATE</w:t>
+            </w:r>
+          </w:p>
+        </w:tc>
+        <w:tc>
+          <w:tcPr>
+            <w:tcW w:type="dxa" w:w="2858"/>
+          </w:tcPr>
+          <w:p>
+            <w:r>
+              <w:t>ACPOSLearningCandidate</w:t>
+            </w:r>
+          </w:p>
+        </w:tc>
+        <w:tc>
+          <w:tcPr>
+            <w:tcW w:type="dxa" w:w="2858"/>
+          </w:tcPr>
+          <w:p>
+            <w:r>
+              <w:t>ACPOSEvolutionEngine / ACPOSLearningCandidate + Evidence/Audit</w:t>
+            </w:r>
+          </w:p>
+        </w:tc>
+        <w:tc>
+          <w:tcPr>
+            <w:tcW w:type="dxa" w:w="2858"/>
+          </w:tcPr>
+          <w:p>
+            <w:r>
+              <w:t>Creates a governed Learning Candidate only from complete real Experience/outcome lineage. Candidate remains non-authoritative until separate governed review/adoption and may not self-write Canon/Criteria/Policy.</w:t>
+            </w:r>
+          </w:p>
+        </w:tc>
+      </w:tr>
+      <w:tr>
+        <w:trPr>
+          <w:cantSplit/>
+        </w:trPr>
+        <w:tc>
+          <w:tcPr>
+            <w:tcW w:type="dxa" w:w="2858"/>
+          </w:tcPr>
+          <w:p>
+            <w:r>
+              <w:t>KB-01-CTL-DRAFT-FROM-EXP</w:t>
+            </w:r>
+          </w:p>
+        </w:tc>
+        <w:tc>
+          <w:tcPr>
+            <w:tcW w:type="dxa" w:w="2858"/>
+          </w:tcPr>
+          <w:p>
+            <w:r>
+              <w:t>KnowledgeVersion / Draft</w:t>
+            </w:r>
+          </w:p>
+        </w:tc>
+        <w:tc>
+          <w:tcPr>
+            <w:tcW w:type="dxa" w:w="2858"/>
+          </w:tcPr>
+          <w:p>
+            <w:r>
+              <w:t>KnowledgeExperienceService / KnowledgeVersion Draft + Evidence/Citation + Audit</w:t>
+            </w:r>
+          </w:p>
+        </w:tc>
+        <w:tc>
+          <w:tcPr>
+            <w:tcW w:type="dxa" w:w="2858"/>
+          </w:tcPr>
+          <w:p>
+            <w:r>
+              <w:t>Creates or updates the governed KnowledgeVersion DRAFT from exact Experience/Evidence/Citation refs and expected version. Draft mutation is versioned and auditable and does not imply approval.</w:t>
+            </w:r>
+          </w:p>
+        </w:tc>
+      </w:tr>
+      <w:tr>
+        <w:trPr>
+          <w:cantSplit/>
+        </w:trPr>
+        <w:tc>
+          <w:tcPr>
+            <w:tcW w:type="dxa" w:w="2858"/>
+          </w:tcPr>
+          <w:p>
+            <w:r>
+              <w:t>KB-01-CTL-DRAFT-SAVE</w:t>
+            </w:r>
+          </w:p>
+        </w:tc>
+        <w:tc>
+          <w:tcPr>
+            <w:tcW w:type="dxa" w:w="2858"/>
+          </w:tcPr>
+          <w:p>
+            <w:r>
+              <w:t>KnowledgeVersion / Draft</w:t>
+            </w:r>
+          </w:p>
+        </w:tc>
+        <w:tc>
+          <w:tcPr>
+            <w:tcW w:type="dxa" w:w="2858"/>
+          </w:tcPr>
+          <w:p>
+            <w:r>
+              <w:t>KnowledgeExperienceService / KnowledgeVersion Draft + Evidence/Citation + Audit</w:t>
+            </w:r>
+          </w:p>
+        </w:tc>
+        <w:tc>
+          <w:tcPr>
+            <w:tcW w:type="dxa" w:w="2858"/>
+          </w:tcPr>
+          <w:p>
+            <w:r>
+              <w:t>Creates or updates the governed KnowledgeVersion DRAFT from exact Experience/Evidence/Citation refs and expected version. Draft mutation is versioned and auditable and does not imply approval.</w:t>
+            </w:r>
+          </w:p>
+        </w:tc>
+      </w:tr>
+      <w:tr>
+        <w:trPr>
+          <w:cantSplit/>
+        </w:trPr>
+        <w:tc>
+          <w:tcPr>
+            <w:tcW w:type="dxa" w:w="2858"/>
+          </w:tcPr>
+          <w:p>
+            <w:r>
+              <w:t>KB-01-CTL-APPROVE</w:t>
+            </w:r>
+          </w:p>
+        </w:tc>
+        <w:tc>
+          <w:tcPr>
+            <w:tcW w:type="dxa" w:w="2858"/>
+          </w:tcPr>
+          <w:p>
+            <w:r>
+              <w:t>KnowledgeVersion / Review</w:t>
+            </w:r>
+          </w:p>
+        </w:tc>
+        <w:tc>
+          <w:tcPr>
+            <w:tcW w:type="dxa" w:w="2858"/>
+          </w:tcPr>
+          <w:p>
+            <w:r>
+              <w:t>KnowledgeExperienceService / KnowledgeVersion Review State + Approval/Review + Audit</w:t>
+            </w:r>
+          </w:p>
+        </w:tc>
+        <w:tc>
+          <w:tcPr>
+            <w:tcW w:type="dxa" w:w="2858"/>
+          </w:tcPr>
+          <w:p>
+            <w:r>
+              <w:t>Persists the exact KnowledgeVersion review transition and human review evidence. APPROVE makes the governed approved version immutable; RETURN/REJECT preserve prior approved versions and evidence lineage rather than overwriting history.</w:t>
+            </w:r>
+          </w:p>
+        </w:tc>
+      </w:tr>
+      <w:tr>
+        <w:trPr>
+          <w:cantSplit/>
+        </w:trPr>
+        <w:tc>
+          <w:tcPr>
+            <w:tcW w:type="dxa" w:w="2858"/>
+          </w:tcPr>
+          <w:p>
+            <w:r>
+              <w:t>KB-01-CTL-RETURN</w:t>
+            </w:r>
+          </w:p>
+        </w:tc>
+        <w:tc>
+          <w:tcPr>
+            <w:tcW w:type="dxa" w:w="2858"/>
+          </w:tcPr>
+          <w:p>
+            <w:r>
+              <w:t>KnowledgeVersion / Review</w:t>
+            </w:r>
+          </w:p>
+        </w:tc>
+        <w:tc>
+          <w:tcPr>
+            <w:tcW w:type="dxa" w:w="2858"/>
+          </w:tcPr>
+          <w:p>
+            <w:r>
+              <w:t>KnowledgeExperienceService / KnowledgeVersion Review State + Approval/Review + Audit</w:t>
+            </w:r>
+          </w:p>
+        </w:tc>
+        <w:tc>
+          <w:tcPr>
+            <w:tcW w:type="dxa" w:w="2858"/>
+          </w:tcPr>
+          <w:p>
+            <w:r>
+              <w:t>Persists the exact KnowledgeVersion review transition and human review evidence. APPROVE makes the governed approved version immutable; RETURN/REJECT preserve prior approved versions and evidence lineage rather than overwriting history.</w:t>
+            </w:r>
+          </w:p>
+        </w:tc>
+      </w:tr>
+      <w:tr>
+        <w:trPr>
+          <w:cantSplit/>
+        </w:trPr>
+        <w:tc>
+          <w:tcPr>
+            <w:tcW w:type="dxa" w:w="2858"/>
+          </w:tcPr>
+          <w:p>
+            <w:r>
+              <w:t>KB-01-CTL-REJECT</w:t>
+            </w:r>
+          </w:p>
+        </w:tc>
+        <w:tc>
+          <w:tcPr>
+            <w:tcW w:type="dxa" w:w="2858"/>
+          </w:tcPr>
+          <w:p>
+            <w:r>
+              <w:t>KnowledgeVersion / Review</w:t>
+            </w:r>
+          </w:p>
+        </w:tc>
+        <w:tc>
+          <w:tcPr>
+            <w:tcW w:type="dxa" w:w="2858"/>
+          </w:tcPr>
+          <w:p>
+            <w:r>
+              <w:t>KnowledgeExperienceService / KnowledgeVersion Review State + Approval/Review + Audit</w:t>
+            </w:r>
+          </w:p>
+        </w:tc>
+        <w:tc>
+          <w:tcPr>
+            <w:tcW w:type="dxa" w:w="2858"/>
+          </w:tcPr>
+          <w:p>
+            <w:r>
+              <w:t>Persists the exact KnowledgeVersion review transition and human review evidence. APPROVE makes the governed approved version immutable; RETURN/REJECT preserve prior approved versions and evidence lineage rather than overwriting history.</w:t>
+            </w:r>
+          </w:p>
+        </w:tc>
+      </w:tr>
+    </w:tbl>
+    <w:p>
+      <w:pPr>
+        <w:pStyle w:val="Heading2"/>
+      </w:pPr>
+      <w:r>
+        <w:t>Shared Invariants / 共用不變式</w:t>
+      </w:r>
+    </w:p>
+    <w:tbl>
+      <w:tblPr>
+        <w:tblStyle w:val="TableGrid"/>
+        <w:tblW w:type="auto" w:w="0"/>
+        <w:tblLook w:firstColumn="1" w:firstRow="1" w:lastColumn="0" w:lastRow="0" w:noHBand="0" w:noVBand="1" w:val="04A0"/>
+      </w:tblPr>
+      <w:tblGrid>
+        <w:gridCol w:w="5717"/>
+        <w:gridCol w:w="5717"/>
+      </w:tblGrid>
+      <w:tr>
+        <w:trPr>
+          <w:cantSplit/>
+        </w:trPr>
+        <w:tc>
+          <w:tcPr>
+            <w:tcW w:type="dxa" w:w="5717"/>
+          </w:tcPr>
+          <w:p>
+            <w:r>
+              <w:t>Invariant</w:t>
+            </w:r>
+          </w:p>
+        </w:tc>
+        <w:tc>
+          <w:tcPr>
+            <w:tcW w:type="dxa" w:w="5717"/>
+          </w:tcPr>
+          <w:p>
+            <w:r>
+              <w:t>Rule</w:t>
+            </w:r>
+          </w:p>
+        </w:tc>
+      </w:tr>
+      <w:tr>
+        <w:trPr>
+          <w:cantSplit/>
+        </w:trPr>
+        <w:tc>
+          <w:tcPr>
+            <w:tcW w:type="dxa" w:w="5717"/>
+          </w:tcPr>
+          <w:p>
+            <w:r>
+              <w:t>Ingress ≠ Persistence Owner</w:t>
+            </w:r>
+          </w:p>
+        </w:tc>
+        <w:tc>
+          <w:tcPr>
+            <w:tcW w:type="dxa" w:w="5717"/>
+          </w:tcPr>
+          <w:p>
+            <w:r>
+              <w:t>Shared route/runtime/identity ingress does not transfer business data authority. The target resource/entity decides canonical persistence.</w:t>
+            </w:r>
+          </w:p>
+        </w:tc>
+      </w:tr>
+      <w:tr>
+        <w:trPr>
+          <w:cantSplit/>
+        </w:trPr>
+        <w:tc>
+          <w:tcPr>
+            <w:tcW w:type="dxa" w:w="5717"/>
+          </w:tcPr>
+          <w:p>
+            <w:r>
+              <w:t>Exact identity/version</w:t>
+            </w:r>
+          </w:p>
+        </w:tc>
+        <w:tc>
+          <w:tcPr>
+            <w:tcW w:type="dxa" w:w="5717"/>
+          </w:tcPr>
+          <w:p>
+            <w:r>
+              <w:t>Every effectful mutation MUST resolve the exact entity/resource identity and version/state required by its current gate; latest/current aliases may not silently replace exact binding.</w:t>
+            </w:r>
+          </w:p>
+        </w:tc>
+      </w:tr>
+      <w:tr>
+        <w:trPr>
+          <w:cantSplit/>
+        </w:trPr>
+        <w:tc>
+          <w:tcPr>
+            <w:tcW w:type="dxa" w:w="5717"/>
+          </w:tcPr>
+          <w:p>
+            <w:r>
+              <w:t>Audit lineage</w:t>
+            </w:r>
+          </w:p>
+        </w:tc>
+        <w:tc>
+          <w:tcPr>
+            <w:tcW w:type="dxa" w:w="5717"/>
+          </w:tcPr>
+          <w:p>
+            <w:r>
+              <w:t>Effectful state/version changes preserve correlation/idempotency/evidence or rationale as applicable and generate/retain governed audit lineage.</w:t>
+            </w:r>
+          </w:p>
+        </w:tc>
+      </w:tr>
+      <w:tr>
+        <w:trPr>
+          <w:cantSplit/>
+        </w:trPr>
+        <w:tc>
+          <w:tcPr>
+            <w:tcW w:type="dxa" w:w="5717"/>
+          </w:tcPr>
+          <w:p>
+            <w:r>
+              <w:t>No parallel authority</w:t>
+            </w:r>
+          </w:p>
+        </w:tc>
+        <w:tc>
+          <w:tcPr>
+            <w:tcW w:type="dxa" w:w="5717"/>
+          </w:tcPr>
+          <w:p>
+            <w:r>
+              <w:t>The closure reuses the existing canonical owner shown in the current Word corpus and MUST NOT create a duplicate store/service for the same concept.</w:t>
+            </w:r>
+          </w:p>
+        </w:tc>
+      </w:tr>
+      <w:tr>
+        <w:trPr>
+          <w:cantSplit/>
+        </w:trPr>
+        <w:tc>
+          <w:tcPr>
+            <w:tcW w:type="dxa" w:w="5717"/>
+          </w:tcPr>
+          <w:p>
+            <w:r>
+              <w:t>Runtime evidence separation</w:t>
+            </w:r>
+          </w:p>
+        </w:tc>
+        <w:tc>
+          <w:tcPr>
+            <w:tcW w:type="dxa" w:w="5717"/>
+          </w:tcPr>
+          <w:p>
+            <w:r>
+              <w:t>A complete design Persistence Owner does not claim application/API/DB/Production execution. Runtime status remains separately evidenced and may remain NOT_EXECUTED where the current Word says so.</w:t>
             </w:r>
           </w:p>
         </w:tc>

</xml_diff>